<commit_message>
Hoan thanh bai thuc hanh Julia - Le Minh Long - N24DCDT046
</commit_message>
<xml_diff>
--- a/LeMinhLong_thuchanhbuoi05.docx
+++ b/LeMinhLong_thuchanhbuoi05.docx
@@ -35,8 +35,6 @@
         </w:rPr>
         <w:t>D24CQDT01-N</w:t>
       </w:r>
-      <w:bookmarkStart w:id="0" w:name="_GoBack"/>
-      <w:bookmarkEnd w:id="0"/>
     </w:p>
     <w:p>
       <w:pPr>
@@ -79,13 +77,8 @@
         </w:rPr>
         <w:t xml:space="preserve">Commit SHA: </w:t>
       </w:r>
-      <w:r>
-        <w:rPr>
-          <w:rFonts w:hint="default" w:ascii="Times New Roman" w:hAnsi="Times New Roman"/>
-          <w:sz w:val="20"/>
-        </w:rPr>
-        <w:t>c5d6ab19f73f53337d2418a01797495841fd6a75</w:t>
-      </w:r>
+      <w:bookmarkStart w:id="0" w:name="_GoBack"/>
+      <w:bookmarkEnd w:id="0"/>
     </w:p>
     <w:p>
       <w:pPr>
@@ -1609,7 +1602,7 @@
     <w:lsdException w:uiPriority="99" w:name="toa heading"/>
     <w:lsdException w:uiPriority="99" w:semiHidden="0" w:name="List"/>
     <w:lsdException w:uiPriority="99" w:semiHidden="0" w:name="List Bullet"/>
-    <w:lsdException w:uiPriority="99" w:semiHidden="0" w:name="List Number"/>
+    <w:lsdException w:qFormat="1" w:uiPriority="99" w:semiHidden="0" w:name="List Number"/>
     <w:lsdException w:uiPriority="99" w:semiHidden="0" w:name="List 2"/>
     <w:lsdException w:uiPriority="99" w:semiHidden="0" w:name="List 3"/>
     <w:lsdException w:uiPriority="99" w:name="List 4"/>
@@ -2292,6 +2285,7 @@
     <w:name w:val="List Number"/>
     <w:basedOn w:val="1"/>
     <w:unhideWhenUsed/>
+    <w:qFormat/>
     <w:uiPriority w:val="99"/>
     <w:pPr>
       <w:numPr>
@@ -14283,6 +14277,7 @@
   </w:style>
   <w:style w:type="paragraph" w:customStyle="1" w:styleId="165">
     <w:name w:val="Compact Table"/>
+    <w:qFormat/>
     <w:uiPriority w:val="0"/>
     <w:pPr>
       <w:spacing w:after="60" w:line="276" w:lineRule="auto"/>

</xml_diff>